<commit_message>
Sanity Creator esce dalla pipeline: i contenuti stanno nel database
Il CMS non serve piu' come agente: i testi modificabili dal cliente vivono
in una tabella (`site_content`, vedi il banco Bottega Nord) e la modifica
passa dal gestionale. Rinumerati pipeline e conteggi (dieci scaffold -> nove),
tolto il riferimento a monte da ai-specialist, e i file di lock di Word
entrano nel .gitignore.

Co-Authored-By: Claude Opus 5 (1M context) <noreply@anthropic.com>
</commit_message>
<xml_diff>
--- a/Web Gun.docx
+++ b/Web Gun.docx
@@ -610,49 +610,6 @@
           <w:sz w:val="24"/>
           <w:szCs w:val="24"/>
         </w:rPr>
-        <w:t>Sanity Creator</w:t>
-      </w:r>
-      <w:r>
-        <w:rPr>
-          <w:i/>
-          <w:iCs/>
-          <w:color w:val="0B5CAD"/>
-          <w:sz w:val="20"/>
-          <w:szCs w:val="20"/>
-        </w:rPr>
-        <w:t xml:space="preserve">   [Da creare]</w:t>
-      </w:r>
-    </w:p>
-    <w:p>
-      <w:pPr>
-        <w:spacing w:after="80"/>
-        <w:ind w:left="360"/>
-      </w:pPr>
-      <w:r>
-        <w:t>Configura il CMS (Sanity) per i contenuti modificabili dal cliente (dal flow sulla foto, non era nel documento). Così il cliente aggiorna testi e prodotti senza toccare il codice.</w:t>
-      </w:r>
-    </w:p>
-    <w:p>
-      <w:pPr>
-        <w:spacing w:before="200" w:after="40"/>
-      </w:pPr>
-      <w:r>
-        <w:rPr>
-          <w:b/>
-          <w:bCs/>
-          <w:sz w:val="24"/>
-          <w:szCs w:val="24"/>
-        </w:rPr>
-        <w:t xml:space="preserve">12. </w:t>
-      </w:r>
-      <w:r>
-        <w:rPr>
-          <w:b/>
-          <w:bCs/>
-          <w:color w:val="0B5CAD"/>
-          <w:sz w:val="24"/>
-          <w:szCs w:val="24"/>
-        </w:rPr>
         <w:t>AI Specialist</w:t>
       </w:r>
       <w:r>
@@ -699,50 +656,50 @@
           <w:sz w:val="24"/>
           <w:szCs w:val="24"/>
         </w:rPr>
+        <w:t xml:space="preserve">12. </w:t>
+      </w:r>
+      <w:r>
+        <w:rPr>
+          <w:b/>
+          <w:bCs/>
+          <w:color w:val="0B5CAD"/>
+          <w:sz w:val="24"/>
+          <w:szCs w:val="24"/>
+        </w:rPr>
+        <w:t>Flow Sentinel</w:t>
+      </w:r>
+      <w:r>
+        <w:rPr>
+          <w:i/>
+          <w:iCs/>
+          <w:color w:val="0B5CAD"/>
+          <w:sz w:val="20"/>
+          <w:szCs w:val="20"/>
+        </w:rPr>
+        <w:t xml:space="preserve">   [Da creare]</w:t>
+      </w:r>
+    </w:p>
+    <w:p>
+      <w:pPr>
+        <w:spacing w:after="80"/>
+        <w:ind w:left="360"/>
+      </w:pPr>
+      <w:r>
+        <w:t>Genera ed esegue test End-to-End con Playwright sui flussi critici (carrello, checkout, login) prima del lancio. Se il checkout si rompe, lo scopre lui e non il cliente.</w:t>
+      </w:r>
+    </w:p>
+    <w:p>
+      <w:pPr>
+        <w:spacing w:before="200" w:after="40"/>
+      </w:pPr>
+      <w:r>
+        <w:rPr>
+          <w:b/>
+          <w:bCs/>
+          <w:sz w:val="24"/>
+          <w:szCs w:val="24"/>
+        </w:rPr>
         <w:t xml:space="preserve">13. </w:t>
-      </w:r>
-      <w:r>
-        <w:rPr>
-          <w:b/>
-          <w:bCs/>
-          <w:color w:val="0B5CAD"/>
-          <w:sz w:val="24"/>
-          <w:szCs w:val="24"/>
-        </w:rPr>
-        <w:t>Flow Sentinel</w:t>
-      </w:r>
-      <w:r>
-        <w:rPr>
-          <w:i/>
-          <w:iCs/>
-          <w:color w:val="0B5CAD"/>
-          <w:sz w:val="20"/>
-          <w:szCs w:val="20"/>
-        </w:rPr>
-        <w:t xml:space="preserve">   [Da creare]</w:t>
-      </w:r>
-    </w:p>
-    <w:p>
-      <w:pPr>
-        <w:spacing w:after="80"/>
-        <w:ind w:left="360"/>
-      </w:pPr>
-      <w:r>
-        <w:t>Genera ed esegue test End-to-End con Playwright sui flussi critici (carrello, checkout, login) prima del lancio. Se il checkout si rompe, lo scopre lui e non il cliente.</w:t>
-      </w:r>
-    </w:p>
-    <w:p>
-      <w:pPr>
-        <w:spacing w:before="200" w:after="40"/>
-      </w:pPr>
-      <w:r>
-        <w:rPr>
-          <w:b/>
-          <w:bCs/>
-          <w:sz w:val="24"/>
-          <w:szCs w:val="24"/>
-        </w:rPr>
-        <w:t xml:space="preserve">14. </w:t>
       </w:r>
       <w:r>
         <w:rPr>
@@ -798,50 +755,50 @@
           <w:sz w:val="24"/>
           <w:szCs w:val="24"/>
         </w:rPr>
+        <w:t xml:space="preserve">14. </w:t>
+      </w:r>
+      <w:r>
+        <w:rPr>
+          <w:b/>
+          <w:bCs/>
+          <w:color w:val="0B5CAD"/>
+          <w:sz w:val="24"/>
+          <w:szCs w:val="24"/>
+        </w:rPr>
+        <w:t>Cyber Shield</w:t>
+      </w:r>
+      <w:r>
+        <w:rPr>
+          <w:i/>
+          <w:iCs/>
+          <w:color w:val="0B5CAD"/>
+          <w:sz w:val="20"/>
+          <w:szCs w:val="20"/>
+        </w:rPr>
+        <w:t xml:space="preserve">   [Da creare]</w:t>
+      </w:r>
+    </w:p>
+    <w:p>
+      <w:pPr>
+        <w:spacing w:after="80"/>
+        <w:ind w:left="360"/>
+      </w:pPr>
+      <w:r>
+        <w:t>Specializzato in cybersecurity: verifica vulnerabilità, permessi, esposizione di dati e configurazioni pericolose prima della messa online.</w:t>
+      </w:r>
+    </w:p>
+    <w:p>
+      <w:pPr>
+        <w:spacing w:before="200" w:after="40"/>
+      </w:pPr>
+      <w:r>
+        <w:rPr>
+          <w:b/>
+          <w:bCs/>
+          <w:sz w:val="24"/>
+          <w:szCs w:val="24"/>
+        </w:rPr>
         <w:t xml:space="preserve">15. </w:t>
-      </w:r>
-      <w:r>
-        <w:rPr>
-          <w:b/>
-          <w:bCs/>
-          <w:color w:val="0B5CAD"/>
-          <w:sz w:val="24"/>
-          <w:szCs w:val="24"/>
-        </w:rPr>
-        <w:t>Cyber Shield</w:t>
-      </w:r>
-      <w:r>
-        <w:rPr>
-          <w:i/>
-          <w:iCs/>
-          <w:color w:val="0B5CAD"/>
-          <w:sz w:val="20"/>
-          <w:szCs w:val="20"/>
-        </w:rPr>
-        <w:t xml:space="preserve">   [Da creare]</w:t>
-      </w:r>
-    </w:p>
-    <w:p>
-      <w:pPr>
-        <w:spacing w:after="80"/>
-        <w:ind w:left="360"/>
-      </w:pPr>
-      <w:r>
-        <w:t>Specializzato in cybersecurity: verifica vulnerabilità, permessi, esposizione di dati e configurazioni pericolose prima della messa online.</w:t>
-      </w:r>
-    </w:p>
-    <w:p>
-      <w:pPr>
-        <w:spacing w:before="200" w:after="40"/>
-      </w:pPr>
-      <w:r>
-        <w:rPr>
-          <w:b/>
-          <w:bCs/>
-          <w:sz w:val="24"/>
-          <w:szCs w:val="24"/>
-        </w:rPr>
-        <w:t xml:space="preserve">16. </w:t>
       </w:r>
       <w:r>
         <w:rPr>
@@ -897,50 +854,50 @@
           <w:sz w:val="24"/>
           <w:szCs w:val="24"/>
         </w:rPr>
+        <w:t xml:space="preserve">16. </w:t>
+      </w:r>
+      <w:r>
+        <w:rPr>
+          <w:b/>
+          <w:bCs/>
+          <w:color w:val="0B5CAD"/>
+          <w:sz w:val="24"/>
+          <w:szCs w:val="24"/>
+        </w:rPr>
+        <w:t>Launchpad</w:t>
+      </w:r>
+      <w:r>
+        <w:rPr>
+          <w:i/>
+          <w:iCs/>
+          <w:color w:val="0B5CAD"/>
+          <w:sz w:val="20"/>
+          <w:szCs w:val="20"/>
+        </w:rPr>
+        <w:t xml:space="preserve">   [Da creare]</w:t>
+      </w:r>
+    </w:p>
+    <w:p>
+      <w:pPr>
+        <w:spacing w:after="80"/>
+        <w:ind w:left="360"/>
+      </w:pPr>
+      <w:r>
+        <w:t>Deployment 1-click su Vercel/Cloudflare con DNS, domini e certificati SSL. L'ultimo miglio: dal codice al sito online.</w:t>
+      </w:r>
+    </w:p>
+    <w:p>
+      <w:pPr>
+        <w:spacing w:before="200" w:after="40"/>
+      </w:pPr>
+      <w:r>
+        <w:rPr>
+          <w:b/>
+          <w:bCs/>
+          <w:sz w:val="24"/>
+          <w:szCs w:val="24"/>
+        </w:rPr>
         <w:t xml:space="preserve">17. </w:t>
-      </w:r>
-      <w:r>
-        <w:rPr>
-          <w:b/>
-          <w:bCs/>
-          <w:color w:val="0B5CAD"/>
-          <w:sz w:val="24"/>
-          <w:szCs w:val="24"/>
-        </w:rPr>
-        <w:t>Launchpad</w:t>
-      </w:r>
-      <w:r>
-        <w:rPr>
-          <w:i/>
-          <w:iCs/>
-          <w:color w:val="0B5CAD"/>
-          <w:sz w:val="20"/>
-          <w:szCs w:val="20"/>
-        </w:rPr>
-        <w:t xml:space="preserve">   [Da creare]</w:t>
-      </w:r>
-    </w:p>
-    <w:p>
-      <w:pPr>
-        <w:spacing w:after="80"/>
-        <w:ind w:left="360"/>
-      </w:pPr>
-      <w:r>
-        <w:t>Deployment 1-click su Vercel/Cloudflare con DNS, domini e certificati SSL. L'ultimo miglio: dal codice al sito online.</w:t>
-      </w:r>
-    </w:p>
-    <w:p>
-      <w:pPr>
-        <w:spacing w:before="200" w:after="40"/>
-      </w:pPr>
-      <w:r>
-        <w:rPr>
-          <w:b/>
-          <w:bCs/>
-          <w:sz w:val="24"/>
-          <w:szCs w:val="24"/>
-        </w:rPr>
-        <w:t xml:space="preserve">18. </w:t>
       </w:r>
       <w:r>
         <w:rPr>

</xml_diff>

<commit_message>
Il documento di regia smette di chiamare «da creare» due agenti finiti
Gestionale Crafter e Flow Sentinel erano ancora segnati in blu: il primo e' v1.0
con due collaudi, il secondo ha appena chiuso P3 su un progetto vero. Fly UI
resta rosso ma con la nota che conta: non esiste, e i componenti si scrivono a
mano dietro la cucitura di src/components/ui.

Co-Authored-By: Claude Fable 5 <noreply@anthropic.com>
</commit_message>
<xml_diff>
--- a/Web Gun.docx
+++ b/Web Gun.docx
@@ -490,7 +490,7 @@
           <w:sz w:val="20"/>
           <w:szCs w:val="20"/>
         </w:rPr>
-        <w:t xml:space="preserve">   [In arrivo dagli amici]</w:t>
+        <w:t xml:space="preserve">   [In arrivo dagli amici]   // NON esiste: i componenti si scrivono a mano dietro src/components/ui (deroga DECISIONI.md §21)</w:t>
       </w:r>
     </w:p>
     <w:p>
@@ -563,7 +563,7 @@
         <w:rPr>
           <w:b/>
           <w:bCs/>
-          <w:color w:val="0B5CAD"/>
+          <w:color w:val="1E8A3C"/>
           <w:sz w:val="24"/>
           <w:szCs w:val="24"/>
         </w:rPr>
@@ -573,11 +573,11 @@
         <w:rPr>
           <w:i/>
           <w:iCs/>
-          <w:color w:val="0B5CAD"/>
-          <w:sz w:val="20"/>
-          <w:szCs w:val="20"/>
-        </w:rPr>
-        <w:t xml:space="preserve">   [Da creare]</w:t>
+          <w:color w:val="1E8A3C"/>
+          <w:sz w:val="20"/>
+          <w:szCs w:val="20"/>
+        </w:rPr>
+        <w:t xml:space="preserve">   [Ce l'ho]   // FATTO — v1.0, due collaudi (e-commerce e accademia), 105 test, gate 7/7</w:t>
       </w:r>
     </w:p>
     <w:p>
@@ -662,7 +662,7 @@
         <w:rPr>
           <w:b/>
           <w:bCs/>
-          <w:color w:val="0B5CAD"/>
+          <w:color w:val="1E8A3C"/>
           <w:sz w:val="24"/>
           <w:szCs w:val="24"/>
         </w:rPr>
@@ -672,11 +672,11 @@
         <w:rPr>
           <w:i/>
           <w:iCs/>
-          <w:color w:val="0B5CAD"/>
-          <w:sz w:val="20"/>
-          <w:szCs w:val="20"/>
-        </w:rPr>
-        <w:t xml:space="preserve">   [Da creare]</w:t>
+          <w:color w:val="1E8A3C"/>
+          <w:sz w:val="20"/>
+          <w:szCs w:val="20"/>
+        </w:rPr>
+        <w:t xml:space="preserve">   [Ce l'ho]   // FATTO — costruita, collaudata e usata su un progetto vero (P3): 106 test, gate 7/7</w:t>
       </w:r>
     </w:p>
     <w:p>

</xml_diff>